<commit_message>
Update Guia do Utilizador iShopping.docx
</commit_message>
<xml_diff>
--- a/Projeto DA/Guia do Utilizador iShopping.docx
+++ b/Projeto DA/Guia do Utilizador iShopping.docx
@@ -154,10 +154,7 @@
           </w:p>
           <w:p>
             <w:r>
-              <w:t xml:space="preserve">Valter Beca </w:t>
-            </w:r>
-            <w:r>
-              <w:t>2025162525</w:t>
+              <w:t>Valter Beca 2025162525</w:t>
             </w:r>
           </w:p>
           <w:p>
@@ -237,14 +234,7 @@
           <w:i/>
           <w:sz w:val="20"/>
         </w:rPr>
-        <w:t>junho</w:t>
-      </w:r>
-      <w:r>
-        <w:rPr>
-          <w:i/>
-          <w:sz w:val="20"/>
-        </w:rPr>
-        <w:t xml:space="preserve"> 2026</w:t>
+        <w:t>junho 2026</w:t>
       </w:r>
     </w:p>
     <w:p>
@@ -254,20 +244,20 @@
     </w:p>
     <w:sdt>
       <w:sdtPr>
+        <w:rPr>
+          <w:rFonts w:ascii="Calibri" w:eastAsiaTheme="minorEastAsia" w:hAnsi="Calibri" w:cstheme="minorBidi"/>
+          <w:b w:val="0"/>
+          <w:bCs w:val="0"/>
+          <w:color w:val="auto"/>
+          <w:sz w:val="22"/>
+          <w:szCs w:val="22"/>
+        </w:rPr>
         <w:id w:val="-1647585867"/>
         <w:docPartObj>
           <w:docPartGallery w:val="Table of Contents"/>
           <w:docPartUnique/>
         </w:docPartObj>
       </w:sdtPr>
-      <w:sdtEndPr>
-        <w:rPr>
-          <w:rFonts w:ascii="Calibri" w:eastAsiaTheme="minorEastAsia" w:hAnsi="Calibri" w:cstheme="minorBidi"/>
-          <w:color w:val="auto"/>
-          <w:sz w:val="22"/>
-          <w:szCs w:val="22"/>
-        </w:rPr>
-      </w:sdtEndPr>
       <w:sdtContent>
         <w:p>
           <w:pPr>
@@ -4973,10 +4963,16 @@
       </w:r>
     </w:p>
     <w:p>
+      <w:pPr>
+        <w:rPr>
+          <w:lang w:val="en-GB"/>
+        </w:rPr>
+      </w:pPr>
       <w:r>
         <w:rPr>
           <w:rFonts w:ascii="Consolas" w:hAnsi="Consolas"/>
           <w:sz w:val="18"/>
+          <w:lang w:val="en-GB"/>
         </w:rPr>
         <w:t>&lt;connectionStrings&gt;</w:t>
       </w:r>
@@ -4984,6 +4980,7 @@
         <w:rPr>
           <w:rFonts w:ascii="Consolas" w:hAnsi="Consolas"/>
           <w:sz w:val="18"/>
+          <w:lang w:val="en-GB"/>
         </w:rPr>
         <w:br/>
         <w:t xml:space="preserve">  &lt;add name="iShoppingContext"</w:t>
@@ -4992,6 +4989,7 @@
         <w:rPr>
           <w:rFonts w:ascii="Consolas" w:hAnsi="Consolas"/>
           <w:sz w:val="18"/>
+          <w:lang w:val="en-GB"/>
         </w:rPr>
         <w:br/>
         <w:t xml:space="preserve">       connectionString="Data Source=(localdb)\MSSQLLocalDB;Initial Catalog=iShoppingDB;Integrated Security=True"</w:t>
@@ -5000,6 +4998,7 @@
         <w:rPr>
           <w:rFonts w:ascii="Consolas" w:hAnsi="Consolas"/>
           <w:sz w:val="18"/>
+          <w:lang w:val="en-GB"/>
         </w:rPr>
         <w:br/>
         <w:t xml:space="preserve">       providerName="System.Data.SqlClient" /&gt;</w:t>
@@ -5008,6 +5007,7 @@
         <w:rPr>
           <w:rFonts w:ascii="Consolas" w:hAnsi="Consolas"/>
           <w:sz w:val="18"/>
+          <w:lang w:val="en-GB"/>
         </w:rPr>
         <w:br/>
         <w:t>&lt;/connectionStrings&gt;</w:t>
@@ -5148,6 +5148,7 @@
       <w:r>
         <w:rPr>
           <w:i/>
+          <w:noProof/>
           <w:color w:val="884400"/>
           <w:sz w:val="20"/>
         </w:rPr>
@@ -5485,6 +5486,9 @@
         </mc:AlternateContent>
       </w:r>
       <w:r>
+        <w:rPr>
+          <w:noProof/>
+        </w:rPr>
         <w:drawing>
           <wp:anchor distT="0" distB="0" distL="114300" distR="114300" simplePos="0" relativeHeight="251658752" behindDoc="0" locked="0" layoutInCell="1" allowOverlap="1" wp14:anchorId="196B6410" wp14:editId="1677A1D5">
             <wp:simplePos x="0" y="0"/>
@@ -5661,6 +5665,9 @@
         <w:keepNext/>
       </w:pPr>
       <w:r>
+        <w:rPr>
+          <w:noProof/>
+        </w:rPr>
         <w:drawing>
           <wp:inline distT="0" distB="0" distL="0" distR="0" wp14:anchorId="752A550F" wp14:editId="7786498E">
             <wp:extent cx="1933420" cy="1438275"/>
@@ -5753,6 +5760,9 @@
         <w:keepNext/>
       </w:pPr>
       <w:r>
+        <w:rPr>
+          <w:noProof/>
+        </w:rPr>
         <w:drawing>
           <wp:inline distT="0" distB="0" distL="0" distR="0" wp14:anchorId="299C7610" wp14:editId="726A12C9">
             <wp:extent cx="1310754" cy="891617"/>
@@ -5874,6 +5884,9 @@
         <w:keepNext/>
       </w:pPr>
       <w:r>
+        <w:rPr>
+          <w:noProof/>
+        </w:rPr>
         <w:drawing>
           <wp:inline distT="0" distB="0" distL="0" distR="0" wp14:anchorId="4CA845FF" wp14:editId="6E9237A7">
             <wp:extent cx="3619500" cy="2076480"/>
@@ -6136,6 +6149,9 @@
         <w:keepNext/>
       </w:pPr>
       <w:r>
+        <w:rPr>
+          <w:noProof/>
+        </w:rPr>
         <w:drawing>
           <wp:inline distT="0" distB="0" distL="0" distR="0" wp14:anchorId="7730C24A" wp14:editId="249A77D6">
             <wp:extent cx="3368332" cy="1425063"/>
@@ -6357,6 +6373,9 @@
         </mc:AlternateContent>
       </w:r>
       <w:r>
+        <w:rPr>
+          <w:noProof/>
+        </w:rPr>
         <w:drawing>
           <wp:anchor distT="0" distB="0" distL="114300" distR="114300" simplePos="0" relativeHeight="251661824" behindDoc="0" locked="0" layoutInCell="1" allowOverlap="1" wp14:anchorId="00A32D72" wp14:editId="2BFC0641">
             <wp:simplePos x="0" y="0"/>
@@ -6518,6 +6537,1040 @@
     </w:p>
     <w:p>
       <w:pPr>
+        <w:pStyle w:val="Ttulo2"/>
+      </w:pPr>
+      <w:bookmarkStart w:id="32" w:name="_Toc231934831"/>
+      <w:r>
+        <w:rPr>
+          <w:rFonts w:ascii="Calibri" w:eastAsiaTheme="minorEastAsia" w:hAnsi="Calibri" w:cstheme="minorBidi"/>
+          <w:bCs w:val="0"/>
+          <w:i/>
+          <w:color w:val="884400"/>
+          <w:sz w:val="20"/>
+          <w:szCs w:val="22"/>
+        </w:rPr>
+        <w:drawing>
+          <wp:inline distT="0" distB="0" distL="0" distR="0" wp14:anchorId="001C3A4A" wp14:editId="7965A015">
+            <wp:extent cx="5972810" cy="3659505"/>
+            <wp:effectExtent l="0" t="0" r="8890" b="0"/>
+            <wp:docPr id="1762044693" name="Imagem 1"/>
+            <wp:cNvGraphicFramePr>
+              <a:graphicFrameLocks xmlns:a="http://schemas.openxmlformats.org/drawingml/2006/main" noChangeAspect="1"/>
+            </wp:cNvGraphicFramePr>
+            <a:graphic xmlns:a="http://schemas.openxmlformats.org/drawingml/2006/main">
+              <a:graphicData uri="http://schemas.openxmlformats.org/drawingml/2006/picture">
+                <pic:pic xmlns:pic="http://schemas.openxmlformats.org/drawingml/2006/picture">
+                  <pic:nvPicPr>
+                    <pic:cNvPr id="1762044693" name=""/>
+                    <pic:cNvPicPr/>
+                  </pic:nvPicPr>
+                  <pic:blipFill>
+                    <a:blip r:embed="rId15"/>
+                    <a:stretch>
+                      <a:fillRect/>
+                    </a:stretch>
+                  </pic:blipFill>
+                  <pic:spPr>
+                    <a:xfrm>
+                      <a:off x="0" y="0"/>
+                      <a:ext cx="5972810" cy="3659505"/>
+                    </a:xfrm>
+                    <a:prstGeom prst="rect">
+                      <a:avLst/>
+                    </a:prstGeom>
+                  </pic:spPr>
+                </pic:pic>
+              </a:graphicData>
+            </a:graphic>
+          </wp:inline>
+        </w:drawing>
+      </w:r>
+      <w:r>
+        <w:t>8.2. Criar, editar e eliminar</w:t>
+      </w:r>
+      <w:bookmarkEnd w:id="32"/>
+    </w:p>
+    <w:p>
+      <w:pPr>
+        <w:pStyle w:val="Listacommarcas"/>
+        <w:ind w:left="340"/>
+      </w:pPr>
+      <w:r>
+        <w:t>Novo: escolher o Tipo, introduzir Designação e clicar em Guardar.</w:t>
+      </w:r>
+    </w:p>
+    <w:p>
+      <w:pPr>
+        <w:pStyle w:val="Listacommarcas"/>
+        <w:ind w:left="340"/>
+      </w:pPr>
+      <w:r>
+        <w:t>Editar: selecionar e alterar os dados pretendidos.</w:t>
+      </w:r>
+    </w:p>
+    <w:p>
+      <w:pPr>
+        <w:pStyle w:val="Listacommarcas"/>
+        <w:ind w:left="340"/>
+      </w:pPr>
+      <w:r>
+        <w:t>Eliminar: só é permitido se o artigo não estiver associado a nenhuma Compra.</w:t>
+      </w:r>
+    </w:p>
+    <w:p>
+      <w:r>
+        <w:br w:type="page"/>
+      </w:r>
+    </w:p>
+    <w:p>
+      <w:pPr>
+        <w:pStyle w:val="Ttulo1"/>
+      </w:pPr>
+      <w:bookmarkStart w:id="33" w:name="_Toc231934832"/>
+      <w:r>
+        <w:rPr>
+          <w:color w:val="1F3A68"/>
+        </w:rPr>
+        <w:lastRenderedPageBreak/>
+        <w:t>9. Gestão do Orçamento Mensal</w:t>
+      </w:r>
+      <w:bookmarkEnd w:id="33"/>
+    </w:p>
+    <w:p>
+      <w:r>
+        <w:t>Aceda através de Gestão &gt; Orçamento.</w:t>
+      </w:r>
+    </w:p>
+    <w:p>
+      <w:pPr>
+        <w:pStyle w:val="Ttulo2"/>
+      </w:pPr>
+      <w:bookmarkStart w:id="34" w:name="_Toc231934833"/>
+      <w:r>
+        <w:t>9.1. Definir o orçamento do mês</w:t>
+      </w:r>
+      <w:bookmarkEnd w:id="34"/>
+    </w:p>
+    <w:p>
+      <w:pPr>
+        <w:pStyle w:val="Listanumerada"/>
+      </w:pPr>
+      <w:r>
+        <w:t>Selecione o Mês/Ano pretendido no controlo de data.</w:t>
+      </w:r>
+    </w:p>
+    <w:p>
+      <w:pPr>
+        <w:pStyle w:val="Listanumerada"/>
+      </w:pPr>
+      <w:r>
+        <w:t>Introduza o Valor (em €) a estabelecer como limite de despesa.</w:t>
+      </w:r>
+    </w:p>
+    <w:p>
+      <w:pPr>
+        <w:pStyle w:val="Listanumerada"/>
+      </w:pPr>
+      <w:r>
+        <w:t>Clique em Guardar.</w:t>
+      </w:r>
+    </w:p>
+    <w:p>
+      <w:r>
+        <w:rPr>
+          <w:i/>
+        </w:rPr>
+        <w:t>Existe apenas um Orçamento por mês. Se já existir um valor definido para o mês selecionado, a aplicação irá perguntar se pretende alterar o valor.</w:t>
+      </w:r>
+    </w:p>
+    <w:p>
+      <w:pPr>
+        <w:pStyle w:val="Ttulo2"/>
+      </w:pPr>
+      <w:bookmarkStart w:id="35" w:name="_Toc231934834"/>
+      <w:r>
+        <w:rPr>
+          <w:rFonts w:ascii="Calibri" w:eastAsiaTheme="minorEastAsia" w:hAnsi="Calibri" w:cstheme="minorBidi"/>
+          <w:bCs w:val="0"/>
+          <w:i/>
+          <w:color w:val="884400"/>
+          <w:sz w:val="20"/>
+          <w:szCs w:val="22"/>
+        </w:rPr>
+        <w:drawing>
+          <wp:inline distT="0" distB="0" distL="0" distR="0" wp14:anchorId="56D8948B" wp14:editId="4DC76C6A">
+            <wp:extent cx="5738357" cy="5182049"/>
+            <wp:effectExtent l="0" t="0" r="0" b="0"/>
+            <wp:docPr id="542222972" name="Imagem 1"/>
+            <wp:cNvGraphicFramePr>
+              <a:graphicFrameLocks xmlns:a="http://schemas.openxmlformats.org/drawingml/2006/main" noChangeAspect="1"/>
+            </wp:cNvGraphicFramePr>
+            <a:graphic xmlns:a="http://schemas.openxmlformats.org/drawingml/2006/main">
+              <a:graphicData uri="http://schemas.openxmlformats.org/drawingml/2006/picture">
+                <pic:pic xmlns:pic="http://schemas.openxmlformats.org/drawingml/2006/picture">
+                  <pic:nvPicPr>
+                    <pic:cNvPr id="542222972" name=""/>
+                    <pic:cNvPicPr/>
+                  </pic:nvPicPr>
+                  <pic:blipFill>
+                    <a:blip r:embed="rId16"/>
+                    <a:stretch>
+                      <a:fillRect/>
+                    </a:stretch>
+                  </pic:blipFill>
+                  <pic:spPr>
+                    <a:xfrm>
+                      <a:off x="0" y="0"/>
+                      <a:ext cx="5738357" cy="5182049"/>
+                    </a:xfrm>
+                    <a:prstGeom prst="rect">
+                      <a:avLst/>
+                    </a:prstGeom>
+                  </pic:spPr>
+                </pic:pic>
+              </a:graphicData>
+            </a:graphic>
+          </wp:inline>
+        </w:drawing>
+      </w:r>
+      <w:r>
+        <w:t>9.2. Alterar o orçamento</w:t>
+      </w:r>
+      <w:bookmarkEnd w:id="35"/>
+    </w:p>
+    <w:p>
+      <w:r>
+        <w:t>A alteração é efetuada da mesma forma. A aplicação regista a data/hora da alteração e o utilizador que a realizou, mantendo igualmente o registo do utilizador que criou o orçamento.</w:t>
+      </w:r>
+    </w:p>
+    <w:p>
+      <w:pPr>
+        <w:pStyle w:val="Ttulo2"/>
+      </w:pPr>
+      <w:bookmarkStart w:id="36" w:name="_Toc231934835"/>
+      <w:r>
+        <w:lastRenderedPageBreak/>
+        <w:t>9.3. Histórico de alterações</w:t>
+      </w:r>
+      <w:bookmarkEnd w:id="36"/>
+    </w:p>
+    <w:p>
+      <w:r>
+        <w:t>No ecrã de orçamento é apresentada uma área informativa com: Criado por / Em e Alterado por / Em, dando rastreabilidade total às modificações.</w:t>
+      </w:r>
+    </w:p>
+    <w:p>
+      <w:r>
+        <w:br w:type="page"/>
+      </w:r>
+    </w:p>
+    <w:p>
+      <w:pPr>
+        <w:pStyle w:val="Ttulo1"/>
+      </w:pPr>
+      <w:bookmarkStart w:id="37" w:name="_Toc231934836"/>
+      <w:r>
+        <w:rPr>
+          <w:color w:val="1F3A68"/>
+        </w:rPr>
+        <w:lastRenderedPageBreak/>
+        <w:t>10. Planeamento de Compras</w:t>
+      </w:r>
+      <w:bookmarkEnd w:id="37"/>
+    </w:p>
+    <w:p>
+      <w:r>
+        <w:t>Aceda através de Compras &gt; Listar Compras ou Compras &gt; Nova Compra.</w:t>
+      </w:r>
+    </w:p>
+    <w:p>
+      <w:pPr>
+        <w:pStyle w:val="Ttulo2"/>
+      </w:pPr>
+      <w:bookmarkStart w:id="38" w:name="_Toc231934837"/>
+      <w:r>
+        <w:t>10.1. Criar uma nova lista de compras</w:t>
+      </w:r>
+      <w:bookmarkEnd w:id="38"/>
+    </w:p>
+    <w:p>
+      <w:pPr>
+        <w:pStyle w:val="Listanumerada"/>
+      </w:pPr>
+      <w:r>
+        <w:t>Clicar em Compras &gt; Nova Compra.</w:t>
+      </w:r>
+    </w:p>
+    <w:p>
+      <w:pPr>
+        <w:pStyle w:val="Listanumerada"/>
+      </w:pPr>
+      <w:r>
+        <w:t>Introduzir um Nome identificativo (ex.: «Compras Pingo Doce — 15/03»).</w:t>
+      </w:r>
+    </w:p>
+    <w:p>
+      <w:pPr>
+        <w:pStyle w:val="Listanumerada"/>
+      </w:pPr>
+      <w:r>
+        <w:t>A data de criação e o utilizador são preenchidos automaticamente.</w:t>
+      </w:r>
+    </w:p>
+    <w:p>
+      <w:pPr>
+        <w:pStyle w:val="Listanumerada"/>
+      </w:pPr>
+      <w:r>
+        <w:t>Clicar em Guardar para começar a adicionar itens.</w:t>
+      </w:r>
+    </w:p>
+    <w:p>
+      <w:pPr>
+        <w:pStyle w:val="Ttulo2"/>
+      </w:pPr>
+      <w:bookmarkStart w:id="39" w:name="_Toc231934838"/>
+      <w:r>
+        <w:rPr>
+          <w:rFonts w:ascii="Calibri" w:eastAsiaTheme="minorEastAsia" w:hAnsi="Calibri" w:cstheme="minorBidi"/>
+          <w:bCs w:val="0"/>
+          <w:i/>
+          <w:color w:val="884400"/>
+          <w:sz w:val="20"/>
+          <w:szCs w:val="22"/>
+        </w:rPr>
+        <w:drawing>
+          <wp:inline distT="0" distB="0" distL="0" distR="0" wp14:anchorId="78F242E1" wp14:editId="00FCB325">
+            <wp:extent cx="5578323" cy="3787468"/>
+            <wp:effectExtent l="0" t="0" r="3810" b="3810"/>
+            <wp:docPr id="1895803522" name="Imagem 1"/>
+            <wp:cNvGraphicFramePr>
+              <a:graphicFrameLocks xmlns:a="http://schemas.openxmlformats.org/drawingml/2006/main" noChangeAspect="1"/>
+            </wp:cNvGraphicFramePr>
+            <a:graphic xmlns:a="http://schemas.openxmlformats.org/drawingml/2006/main">
+              <a:graphicData uri="http://schemas.openxmlformats.org/drawingml/2006/picture">
+                <pic:pic xmlns:pic="http://schemas.openxmlformats.org/drawingml/2006/picture">
+                  <pic:nvPicPr>
+                    <pic:cNvPr id="1895803522" name=""/>
+                    <pic:cNvPicPr/>
+                  </pic:nvPicPr>
+                  <pic:blipFill>
+                    <a:blip r:embed="rId17"/>
+                    <a:stretch>
+                      <a:fillRect/>
+                    </a:stretch>
+                  </pic:blipFill>
+                  <pic:spPr>
+                    <a:xfrm>
+                      <a:off x="0" y="0"/>
+                      <a:ext cx="5578323" cy="3787468"/>
+                    </a:xfrm>
+                    <a:prstGeom prst="rect">
+                      <a:avLst/>
+                    </a:prstGeom>
+                  </pic:spPr>
+                </pic:pic>
+              </a:graphicData>
+            </a:graphic>
+          </wp:inline>
+        </w:drawing>
+      </w:r>
+      <w:r>
+        <w:t>10.2. Adicionar itens previstos</w:t>
+      </w:r>
+      <w:bookmarkEnd w:id="39"/>
+    </w:p>
+    <w:p>
+      <w:pPr>
+        <w:pStyle w:val="Listanumerada"/>
+      </w:pPr>
+      <w:r>
+        <w:t>Clicar em Adicionar Item Previsto.</w:t>
+      </w:r>
+    </w:p>
+    <w:p>
+      <w:pPr>
+        <w:pStyle w:val="Listanumerada"/>
+      </w:pPr>
+      <w:r>
+        <w:t>Selecionar o Tipo de Artigo no primeiro ComboBox (filtro obrigatório).</w:t>
+      </w:r>
+    </w:p>
+    <w:p>
+      <w:pPr>
+        <w:pStyle w:val="Listanumerada"/>
+      </w:pPr>
+      <w:r>
+        <w:t>Selecionar o Artigo pretendido no segundo ComboBox.</w:t>
+      </w:r>
+    </w:p>
+    <w:p>
+      <w:pPr>
+        <w:pStyle w:val="Listanumerada"/>
+      </w:pPr>
+      <w:r>
+        <w:t>Indicar a Quantidade Prevista a adquirir.</w:t>
+      </w:r>
+    </w:p>
+    <w:p>
+      <w:pPr>
+        <w:pStyle w:val="Listanumerada"/>
+      </w:pPr>
+      <w:r>
+        <w:t>Clicar em Adicionar. O item passa a constar da lista da compra.</w:t>
+      </w:r>
+    </w:p>
+    <w:p>
+      <w:pPr>
+        <w:pStyle w:val="Ttulo2"/>
+      </w:pPr>
+      <w:bookmarkStart w:id="40" w:name="_Toc231934839"/>
+      <w:r>
+        <w:t>10.3. Editar a lista (enquanto aberta)</w:t>
+      </w:r>
+      <w:bookmarkEnd w:id="40"/>
+    </w:p>
+    <w:p>
+      <w:r>
+        <w:t>Enquanto a compra estiver aberta (estado Não Fechada), pode adicionar, alterar ou remover itens previstos. A aplicação regista quem fez cada alteração e a respetiva data.</w:t>
+      </w:r>
+    </w:p>
+    <w:p>
+      <w:r>
+        <w:rPr>
+          <w:i/>
+        </w:rPr>
+        <w:t>Compras fechadas ficam em modo de leitura — não é permitida qualquer alteração.</w:t>
+      </w:r>
+    </w:p>
+    <w:p>
+      <w:r>
+        <w:br w:type="page"/>
+      </w:r>
+    </w:p>
+    <w:p>
+      <w:pPr>
+        <w:pStyle w:val="Ttulo1"/>
+      </w:pPr>
+      <w:bookmarkStart w:id="41" w:name="_Toc231934840"/>
+      <w:r>
+        <w:rPr>
+          <w:color w:val="1F3A68"/>
+        </w:rPr>
+        <w:lastRenderedPageBreak/>
+        <w:t>11. Modo Compra — Execução da Compra</w:t>
+      </w:r>
+      <w:bookmarkEnd w:id="41"/>
+    </w:p>
+    <w:p>
+      <w:r>
+        <w:t>O Modo Compra é utilizado no momento em que está fisicamente a fazer a compra. Permite registar o que foi efetivamente adquirido, quantidades reais, preços e itens não previstos.</w:t>
+      </w:r>
+    </w:p>
+    <w:p>
+      <w:pPr>
+        <w:pStyle w:val="Ttulo2"/>
+      </w:pPr>
+      <w:bookmarkStart w:id="42" w:name="_Toc231934841"/>
+      <w:r>
+        <w:t>11.1. Entrar em modo compra</w:t>
+      </w:r>
+      <w:bookmarkEnd w:id="42"/>
+    </w:p>
+    <w:p>
+      <w:pPr>
+        <w:pStyle w:val="Listanumerada"/>
+      </w:pPr>
+      <w:r>
+        <w:t>Em Compras &gt; Listar Compras, selecionar a compra pretendida.</w:t>
+      </w:r>
+    </w:p>
+    <w:p>
+      <w:pPr>
+        <w:pStyle w:val="Listanumerada"/>
+      </w:pPr>
+      <w:r>
+        <w:t>Clicar em Iniciar Compra.</w:t>
+      </w:r>
+    </w:p>
+    <w:p>
+      <w:pPr>
+        <w:pStyle w:val="Listanumerada"/>
+      </w:pPr>
+      <w:r>
+        <w:t>O ecrã apresenta a lista de itens previstos e o orçamento disponível.</w:t>
+      </w:r>
+    </w:p>
+    <w:p>
+      <w:pPr>
+        <w:pStyle w:val="Ttulo2"/>
+      </w:pPr>
+      <w:bookmarkStart w:id="43" w:name="_Toc231934842"/>
+      <w:r>
+        <w:rPr>
+          <w:rFonts w:ascii="Calibri" w:eastAsiaTheme="minorEastAsia" w:hAnsi="Calibri" w:cstheme="minorBidi"/>
+          <w:bCs w:val="0"/>
+          <w:i/>
+          <w:color w:val="884400"/>
+          <w:sz w:val="20"/>
+          <w:szCs w:val="22"/>
+        </w:rPr>
+        <w:drawing>
+          <wp:inline distT="0" distB="0" distL="0" distR="0" wp14:anchorId="55682067" wp14:editId="68B2EFDC">
+            <wp:extent cx="5972810" cy="3462655"/>
+            <wp:effectExtent l="0" t="0" r="8890" b="4445"/>
+            <wp:docPr id="908354" name="Imagem 1"/>
+            <wp:cNvGraphicFramePr>
+              <a:graphicFrameLocks xmlns:a="http://schemas.openxmlformats.org/drawingml/2006/main" noChangeAspect="1"/>
+            </wp:cNvGraphicFramePr>
+            <a:graphic xmlns:a="http://schemas.openxmlformats.org/drawingml/2006/main">
+              <a:graphicData uri="http://schemas.openxmlformats.org/drawingml/2006/picture">
+                <pic:pic xmlns:pic="http://schemas.openxmlformats.org/drawingml/2006/picture">
+                  <pic:nvPicPr>
+                    <pic:cNvPr id="908354" name=""/>
+                    <pic:cNvPicPr/>
+                  </pic:nvPicPr>
+                  <pic:blipFill>
+                    <a:blip r:embed="rId18"/>
+                    <a:stretch>
+                      <a:fillRect/>
+                    </a:stretch>
+                  </pic:blipFill>
+                  <pic:spPr>
+                    <a:xfrm>
+                      <a:off x="0" y="0"/>
+                      <a:ext cx="5972810" cy="3462655"/>
+                    </a:xfrm>
+                    <a:prstGeom prst="rect">
+                      <a:avLst/>
+                    </a:prstGeom>
+                  </pic:spPr>
+                </pic:pic>
+              </a:graphicData>
+            </a:graphic>
+          </wp:inline>
+        </w:drawing>
+      </w:r>
+      <w:r>
+        <w:t>11.2. Registar aquisição de itens previstos</w:t>
+      </w:r>
+      <w:bookmarkEnd w:id="43"/>
+    </w:p>
+    <w:p>
+      <w:pPr>
+        <w:pStyle w:val="Listanumerada"/>
+      </w:pPr>
+      <w:r>
+        <w:t>Selecionar a linha do item previsto a adquirir.</w:t>
+      </w:r>
+    </w:p>
+    <w:p>
+      <w:pPr>
+        <w:pStyle w:val="Listanumerada"/>
+      </w:pPr>
+      <w:r>
+        <w:t>Indicar a Quantidade Adquirida (pode diferir da prevista).</w:t>
+      </w:r>
+    </w:p>
+    <w:p>
+      <w:pPr>
+        <w:pStyle w:val="Listanumerada"/>
+      </w:pPr>
+      <w:r>
+        <w:t>Indicar o Preço Unitário praticado (€).</w:t>
+      </w:r>
+    </w:p>
+    <w:p>
+      <w:pPr>
+        <w:pStyle w:val="Listanumerada"/>
+      </w:pPr>
+      <w:r>
+        <w:t>Clicar em Confirmar Item. O valor total do item é calculado automaticamente e descontado ao orçamento disponível.</w:t>
+      </w:r>
+    </w:p>
+    <w:p>
+      <w:pPr>
+        <w:pStyle w:val="Ttulo2"/>
+      </w:pPr>
+      <w:bookmarkStart w:id="44" w:name="_Toc231934843"/>
+      <w:r>
+        <w:t>11.3. Adicionar itens não previstos</w:t>
+      </w:r>
+      <w:bookmarkEnd w:id="44"/>
+    </w:p>
+    <w:p>
+      <w:pPr>
+        <w:pStyle w:val="Listanumerada"/>
+      </w:pPr>
+      <w:r>
+        <w:t>Clicar em Adicionar Item Não Previsto.</w:t>
+      </w:r>
+    </w:p>
+    <w:p>
+      <w:pPr>
+        <w:pStyle w:val="Listanumerada"/>
+      </w:pPr>
+      <w:r>
+        <w:t>Selecionar Tipo de Artigo e Artigo (filtro obrigatório por tipo).</w:t>
+      </w:r>
+    </w:p>
+    <w:p>
+      <w:pPr>
+        <w:pStyle w:val="Listanumerada"/>
+      </w:pPr>
+      <w:r>
+        <w:t>Indicar Quantidade Adquirida, Preço Unitário e (opcional) Observações.</w:t>
+      </w:r>
+    </w:p>
+    <w:p>
+      <w:pPr>
+        <w:pStyle w:val="Listanumerada"/>
+      </w:pPr>
+      <w:r>
+        <w:t>Clicar em Adicionar. O item entra na lista já como Adquirido.</w:t>
+      </w:r>
+    </w:p>
+    <w:p>
+      <w:pPr>
+        <w:pStyle w:val="Ttulo2"/>
+      </w:pPr>
+      <w:bookmarkStart w:id="45" w:name="_Toc231934844"/>
+      <w:r>
+        <w:t>11.4. Acompanhamento do orçamento em tempo real</w:t>
+      </w:r>
+      <w:bookmarkEnd w:id="45"/>
+    </w:p>
+    <w:p>
+      <w:r>
+        <w:t>No topo do ecrã é exibido o painel de Orçamento com três valores:</w:t>
+      </w:r>
+    </w:p>
+    <w:p>
+      <w:pPr>
+        <w:pStyle w:val="Listacommarcas"/>
+        <w:ind w:left="340"/>
+      </w:pPr>
+      <w:r>
+        <w:t>Orçamento mensal definido.</w:t>
+      </w:r>
+    </w:p>
+    <w:p>
+      <w:pPr>
+        <w:pStyle w:val="Listacommarcas"/>
+        <w:ind w:left="340"/>
+      </w:pPr>
+      <w:r>
+        <w:lastRenderedPageBreak/>
+        <w:t>Total já gasto no mês corrente (incluindo a compra atual em curso).</w:t>
+      </w:r>
+    </w:p>
+    <w:p>
+      <w:pPr>
+        <w:pStyle w:val="Listacommarcas"/>
+        <w:ind w:left="340"/>
+      </w:pPr>
+      <w:r>
+        <w:t>Disponível — diferença entre o orçamento e o gasto.</w:t>
+      </w:r>
+    </w:p>
+    <w:p>
+      <w:r>
+        <w:t>Estes valores são atualizados a cada novo item registado.</w:t>
+      </w:r>
+    </w:p>
+    <w:p>
+      <w:pPr>
+        <w:pStyle w:val="Ttulo2"/>
+      </w:pPr>
+      <w:bookmarkStart w:id="46" w:name="_Toc231934846"/>
+      <w:r>
+        <w:t>11.</w:t>
+      </w:r>
+      <w:r>
+        <w:t>5</w:t>
+      </w:r>
+      <w:r>
+        <w:t>. Fechar a compra</w:t>
+      </w:r>
+      <w:bookmarkEnd w:id="46"/>
+    </w:p>
+    <w:p>
+      <w:pPr>
+        <w:pStyle w:val="Listanumerada"/>
+      </w:pPr>
+      <w:r>
+        <w:t>Após registar todos os itens, clicar em Fechar Compra.</w:t>
+      </w:r>
+    </w:p>
+    <w:p>
+      <w:pPr>
+        <w:pStyle w:val="Listanumerada"/>
+      </w:pPr>
+      <w:r>
+        <w:t>Confirmar a operação no diálogo apresentado.</w:t>
+      </w:r>
+    </w:p>
+    <w:p>
+      <w:pPr>
+        <w:pStyle w:val="Listanumerada"/>
+      </w:pPr>
+      <w:r>
+        <w:t>A compra passa ao estado Fechada, ficando registadas a data/hora de fecho e o utilizador que a fechou.</w:t>
+      </w:r>
+    </w:p>
+    <w:p>
+      <w:r>
+        <w:rPr>
+          <w:i/>
+        </w:rPr>
+        <w:t>Atenção: depois de fechada, a compra não poderá ser reaberta nem alterada.</w:t>
+      </w:r>
+    </w:p>
+    <w:p>
+      <w:r>
+        <w:br w:type="page"/>
+      </w:r>
+    </w:p>
+    <w:p>
+      <w:pPr>
+        <w:pStyle w:val="Ttulo1"/>
+      </w:pPr>
+      <w:bookmarkStart w:id="47" w:name="_Toc231934847"/>
+      <w:r>
+        <w:rPr>
+          <w:color w:val="1F3A68"/>
+        </w:rPr>
+        <w:lastRenderedPageBreak/>
+        <w:t>12. Exportação de Dados (CSV)</w:t>
+      </w:r>
+      <w:bookmarkEnd w:id="47"/>
+    </w:p>
+    <w:p>
+      <w:pPr>
+        <w:pStyle w:val="Ttulo2"/>
+      </w:pPr>
+      <w:bookmarkStart w:id="48" w:name="_Toc231934848"/>
+      <w:r>
+        <w:t>12.1. Exportar compra fechada</w:t>
+      </w:r>
+      <w:bookmarkEnd w:id="48"/>
+    </w:p>
+    <w:p>
+      <w:pPr>
+        <w:pStyle w:val="Listanumerada"/>
+      </w:pPr>
+      <w:r>
+        <w:t>Aceder a Compras &gt; Listar Compras.</w:t>
+      </w:r>
+    </w:p>
+    <w:p>
+      <w:pPr>
+        <w:pStyle w:val="Listanumerada"/>
+      </w:pPr>
+      <w:r>
+        <w:t>Selecionar uma compra no estado Fechada.</w:t>
+      </w:r>
+    </w:p>
+    <w:p>
+      <w:pPr>
+        <w:pStyle w:val="Listanumerada"/>
+      </w:pPr>
+      <w:r>
+        <w:t>Clicar em Exportar CSV.</w:t>
+      </w:r>
+    </w:p>
+    <w:p>
+      <w:pPr>
+        <w:pStyle w:val="Listanumerada"/>
+      </w:pPr>
+      <w:r>
+        <w:t>Escolher o local e nome do ficheiro a guardar.</w:t>
+      </w:r>
+    </w:p>
+    <w:p>
+      <w:pPr>
+        <w:pStyle w:val="Ttulo2"/>
+      </w:pPr>
+      <w:bookmarkStart w:id="49" w:name="_Toc231934849"/>
+      <w:r>
+        <w:rPr>
+          <w:rFonts w:ascii="Calibri" w:eastAsiaTheme="minorEastAsia" w:hAnsi="Calibri" w:cstheme="minorBidi"/>
+          <w:bCs w:val="0"/>
+          <w:i/>
+          <w:color w:val="884400"/>
+          <w:sz w:val="20"/>
+          <w:szCs w:val="22"/>
+        </w:rPr>
+        <w:drawing>
+          <wp:inline distT="0" distB="0" distL="0" distR="0" wp14:anchorId="6ACB366A" wp14:editId="29CD29D2">
+            <wp:extent cx="5972810" cy="3117850"/>
+            <wp:effectExtent l="0" t="0" r="8890" b="6350"/>
+            <wp:docPr id="1911595423" name="Imagem 1"/>
+            <wp:cNvGraphicFramePr>
+              <a:graphicFrameLocks xmlns:a="http://schemas.openxmlformats.org/drawingml/2006/main" noChangeAspect="1"/>
+            </wp:cNvGraphicFramePr>
+            <a:graphic xmlns:a="http://schemas.openxmlformats.org/drawingml/2006/main">
+              <a:graphicData uri="http://schemas.openxmlformats.org/drawingml/2006/picture">
+                <pic:pic xmlns:pic="http://schemas.openxmlformats.org/drawingml/2006/picture">
+                  <pic:nvPicPr>
+                    <pic:cNvPr id="1911595423" name=""/>
+                    <pic:cNvPicPr/>
+                  </pic:nvPicPr>
+                  <pic:blipFill>
+                    <a:blip r:embed="rId19"/>
+                    <a:stretch>
+                      <a:fillRect/>
+                    </a:stretch>
+                  </pic:blipFill>
+                  <pic:spPr>
+                    <a:xfrm>
+                      <a:off x="0" y="0"/>
+                      <a:ext cx="5972810" cy="3117850"/>
+                    </a:xfrm>
+                    <a:prstGeom prst="rect">
+                      <a:avLst/>
+                    </a:prstGeom>
+                  </pic:spPr>
+                </pic:pic>
+              </a:graphicData>
+            </a:graphic>
+          </wp:inline>
+        </w:drawing>
+      </w:r>
+      <w:r>
+        <w:t>12.2. Estrutura do ficheiro CSV</w:t>
+      </w:r>
+      <w:bookmarkEnd w:id="49"/>
+    </w:p>
+    <w:p>
+      <w:r>
+        <w:t>O delimitador utilizado é o ponto e vírgula («;»). As colunas exportadas são, por esta ordem:</w:t>
+      </w:r>
+    </w:p>
+    <w:p>
+      <w:pPr>
+        <w:pStyle w:val="Listacommarcas"/>
+        <w:ind w:left="340"/>
+      </w:pPr>
+      <w:r>
+        <w:t>NomeCompra</w:t>
+      </w:r>
+    </w:p>
+    <w:p>
+      <w:pPr>
+        <w:pStyle w:val="Listacommarcas"/>
+        <w:ind w:left="340"/>
+      </w:pPr>
+      <w:r>
+        <w:t>DataCriacao</w:t>
+      </w:r>
+    </w:p>
+    <w:p>
+      <w:pPr>
+        <w:pStyle w:val="Listacommarcas"/>
+        <w:ind w:left="340"/>
+      </w:pPr>
+      <w:r>
+        <w:t>DataFechada</w:t>
+      </w:r>
+    </w:p>
+    <w:p>
+      <w:pPr>
+        <w:pStyle w:val="Listacommarcas"/>
+        <w:ind w:left="340"/>
+      </w:pPr>
+      <w:r>
+        <w:t>NomeArtigo</w:t>
+      </w:r>
+    </w:p>
+    <w:p>
+      <w:pPr>
+        <w:pStyle w:val="Listacommarcas"/>
+        <w:ind w:left="340"/>
+      </w:pPr>
+      <w:r>
+        <w:t>ArtigoPrevisto (Sim/Não)</w:t>
+      </w:r>
+    </w:p>
+    <w:p>
+      <w:pPr>
+        <w:pStyle w:val="Listacommarcas"/>
+        <w:ind w:left="340"/>
+      </w:pPr>
+      <w:r>
+        <w:t>ArtigoNaoPrevisto (Sim/Não)</w:t>
+      </w:r>
+    </w:p>
+    <w:p>
+      <w:pPr>
+        <w:pStyle w:val="Listacommarcas"/>
+        <w:ind w:left="340"/>
+      </w:pPr>
+      <w:r>
+        <w:t>QuantidadePrevista</w:t>
+      </w:r>
+    </w:p>
+    <w:p>
+      <w:pPr>
+        <w:pStyle w:val="Listacommarcas"/>
+        <w:ind w:left="340"/>
+      </w:pPr>
+      <w:r>
+        <w:t>QuantidadeAdquirida</w:t>
+      </w:r>
+    </w:p>
+    <w:p>
+      <w:pPr>
+        <w:pStyle w:val="Listacommarcas"/>
+        <w:ind w:left="340"/>
+      </w:pPr>
+      <w:r>
+        <w:t>PrecoUnitario</w:t>
+      </w:r>
+    </w:p>
+    <w:p>
+      <w:r>
+        <w:t>O ficheiro pode ser aberto em Excel, LibreOffice Calc ou qualquer editor de texto.</w:t>
+      </w:r>
+    </w:p>
+    <w:p>
+      <w:r>
+        <w:br w:type="page"/>
+      </w:r>
+    </w:p>
+    <w:p>
+      <w:pPr>
+        <w:pStyle w:val="Ttulo1"/>
+      </w:pPr>
+      <w:bookmarkStart w:id="50" w:name="_Toc231934850"/>
+      <w:r>
+        <w:rPr>
+          <w:color w:val="1F3A68"/>
+        </w:rPr>
+        <w:lastRenderedPageBreak/>
+        <w:t>13. Estatísticas e Sugestões</w:t>
+      </w:r>
+      <w:bookmarkEnd w:id="50"/>
+    </w:p>
+    <w:p>
+      <w:r>
+        <w:t>Aceda através de Estatísticas no menu principal. O ecrã está organizado em dois separadores.</w:t>
+      </w:r>
+    </w:p>
+    <w:p>
+      <w:pPr>
+        <w:pStyle w:val="Ttulo2"/>
+      </w:pPr>
+      <w:bookmarkStart w:id="51" w:name="_Toc231934851"/>
+      <w:r>
+        <w:t>13.1. Separador 1 — Análise histórica</w:t>
+      </w:r>
+      <w:bookmarkEnd w:id="51"/>
+    </w:p>
+    <w:p>
+      <w:r>
+        <w:t>Apresenta duas tabelas:</w:t>
+      </w:r>
+    </w:p>
+    <w:p>
+      <w:pPr>
+        <w:pStyle w:val="Listacommarcas"/>
+        <w:ind w:left="340"/>
+      </w:pPr>
+      <w:r>
+        <w:t>Resumo Mensal — para cada mês: Orçamento, Total de Compras e Diferença (positiva ou negativa).</w:t>
+      </w:r>
+    </w:p>
+    <w:p>
+      <w:pPr>
+        <w:pStyle w:val="Listacommarcas"/>
+        <w:ind w:left="340"/>
+      </w:pPr>
+      <w:r>
+        <w:t>Compras Fechadas — listagem das compras com a percentagem de itens previstos vs. não previstos.</w:t>
+      </w:r>
+    </w:p>
+    <w:p>
+      <w:pPr>
+        <w:pStyle w:val="Ttulo2"/>
+      </w:pPr>
+      <w:bookmarkStart w:id="52" w:name="_Toc231934852"/>
+      <w:r>
+        <w:rPr>
+          <w:rFonts w:ascii="Calibri" w:eastAsiaTheme="minorEastAsia" w:hAnsi="Calibri" w:cstheme="minorBidi"/>
+          <w:bCs w:val="0"/>
+          <w:i/>
+          <w:color w:val="884400"/>
+          <w:sz w:val="20"/>
+          <w:szCs w:val="22"/>
+        </w:rPr>
+        <w:lastRenderedPageBreak/>
+        <w:drawing>
+          <wp:inline distT="0" distB="0" distL="0" distR="0" wp14:anchorId="230E0AA5" wp14:editId="5F5728A0">
+            <wp:extent cx="5972810" cy="6551930"/>
+            <wp:effectExtent l="0" t="0" r="8890" b="1270"/>
+            <wp:docPr id="88887309" name="Imagem 1"/>
+            <wp:cNvGraphicFramePr>
+              <a:graphicFrameLocks xmlns:a="http://schemas.openxmlformats.org/drawingml/2006/main" noChangeAspect="1"/>
+            </wp:cNvGraphicFramePr>
+            <a:graphic xmlns:a="http://schemas.openxmlformats.org/drawingml/2006/main">
+              <a:graphicData uri="http://schemas.openxmlformats.org/drawingml/2006/picture">
+                <pic:pic xmlns:pic="http://schemas.openxmlformats.org/drawingml/2006/picture">
+                  <pic:nvPicPr>
+                    <pic:cNvPr id="88887309" name=""/>
+                    <pic:cNvPicPr/>
+                  </pic:nvPicPr>
+                  <pic:blipFill>
+                    <a:blip r:embed="rId20"/>
+                    <a:stretch>
+                      <a:fillRect/>
+                    </a:stretch>
+                  </pic:blipFill>
+                  <pic:spPr>
+                    <a:xfrm>
+                      <a:off x="0" y="0"/>
+                      <a:ext cx="5972810" cy="6551930"/>
+                    </a:xfrm>
+                    <a:prstGeom prst="rect">
+                      <a:avLst/>
+                    </a:prstGeom>
+                  </pic:spPr>
+                </pic:pic>
+              </a:graphicData>
+            </a:graphic>
+          </wp:inline>
+        </w:drawing>
+      </w:r>
+      <w:r>
+        <w:t>13.2. Separador 2 — Sugestões para o próximo mês</w:t>
+      </w:r>
+      <w:bookmarkEnd w:id="52"/>
+    </w:p>
+    <w:p>
+      <w:r>
+        <w:t>Com base no histórico, a aplicação produz duas sugestões:</w:t>
+      </w:r>
+    </w:p>
+    <w:p>
+      <w:pPr>
+        <w:pStyle w:val="Listacommarcas"/>
+        <w:ind w:left="340"/>
+      </w:pPr>
+      <w:r>
+        <w:t>Sugestão de Orçamento — calculada a partir dos orçamentos e gastos dos meses anteriores.</w:t>
+      </w:r>
+    </w:p>
+    <w:p>
+      <w:pPr>
+        <w:pStyle w:val="Listacommarcas"/>
+        <w:ind w:left="340"/>
+      </w:pPr>
+      <w:r>
+        <w:t>Sugestão de Lista de Compras — gerada considerando a semana atual do mês e as listas realizadas em semanas equivalentes em períodos anteriores.</w:t>
+      </w:r>
+    </w:p>
+    <w:p>
+      <w:pPr>
         <w:jc w:val="center"/>
       </w:pPr>
       <w:r>
@@ -6527,57 +7580,50 @@
           <w:color w:val="884400"/>
           <w:sz w:val="20"/>
         </w:rPr>
-        <w:t>[ INSERIR SCREENSHOT: Listagem de Artigos com filtro por Tipo de Artigo ]</w:t>
-      </w:r>
-    </w:p>
-    <w:p>
-      <w:pPr>
-        <w:jc w:val="center"/>
-      </w:pPr>
+        <w:lastRenderedPageBreak/>
+        <w:drawing>
+          <wp:inline distT="0" distB="0" distL="0" distR="0" wp14:anchorId="76D07744" wp14:editId="28D526C0">
+            <wp:extent cx="5972810" cy="6158230"/>
+            <wp:effectExtent l="0" t="0" r="8890" b="0"/>
+            <wp:docPr id="1747012165" name="Imagem 1"/>
+            <wp:cNvGraphicFramePr>
+              <a:graphicFrameLocks xmlns:a="http://schemas.openxmlformats.org/drawingml/2006/main" noChangeAspect="1"/>
+            </wp:cNvGraphicFramePr>
+            <a:graphic xmlns:a="http://schemas.openxmlformats.org/drawingml/2006/main">
+              <a:graphicData uri="http://schemas.openxmlformats.org/drawingml/2006/picture">
+                <pic:pic xmlns:pic="http://schemas.openxmlformats.org/drawingml/2006/picture">
+                  <pic:nvPicPr>
+                    <pic:cNvPr id="1747012165" name=""/>
+                    <pic:cNvPicPr/>
+                  </pic:nvPicPr>
+                  <pic:blipFill>
+                    <a:blip r:embed="rId21"/>
+                    <a:stretch>
+                      <a:fillRect/>
+                    </a:stretch>
+                  </pic:blipFill>
+                  <pic:spPr>
+                    <a:xfrm>
+                      <a:off x="0" y="0"/>
+                      <a:ext cx="5972810" cy="6158230"/>
+                    </a:xfrm>
+                    <a:prstGeom prst="rect">
+                      <a:avLst/>
+                    </a:prstGeom>
+                  </pic:spPr>
+                </pic:pic>
+              </a:graphicData>
+            </a:graphic>
+          </wp:inline>
+        </w:drawing>
+      </w:r>
       <w:r>
         <w:rPr>
           <w:i/>
           <w:color w:val="808080"/>
           <w:sz w:val="18"/>
         </w:rPr>
-        <w:t>(substituir esta linha pela imagem correspondente)</w:t>
-      </w:r>
-    </w:p>
-    <w:p>
-      <w:pPr>
-        <w:pStyle w:val="Ttulo2"/>
-      </w:pPr>
-      <w:bookmarkStart w:id="32" w:name="_Toc231934831"/>
-      <w:r>
-        <w:t>8.2. Criar, editar e eliminar</w:t>
-      </w:r>
-      <w:bookmarkEnd w:id="32"/>
-    </w:p>
-    <w:p>
-      <w:pPr>
-        <w:pStyle w:val="Listacommarcas"/>
-        <w:ind w:left="340"/>
-      </w:pPr>
-      <w:r>
-        <w:t>Novo: escolher o Tipo, introduzir Designação e clicar em Guardar.</w:t>
-      </w:r>
-    </w:p>
-    <w:p>
-      <w:pPr>
-        <w:pStyle w:val="Listacommarcas"/>
-        <w:ind w:left="340"/>
-      </w:pPr>
-      <w:r>
-        <w:t>Editar: selecionar e alterar os dados pretendidos.</w:t>
-      </w:r>
-    </w:p>
-    <w:p>
-      <w:pPr>
-        <w:pStyle w:val="Listacommarcas"/>
-        <w:ind w:left="340"/>
-      </w:pPr>
-      <w:r>
-        <w:t>Eliminar: só é permitido se o artigo não estiver associado a nenhuma Compra.</w:t>
+        <w:t>)</w:t>
       </w:r>
     </w:p>
     <w:p>
@@ -6589,984 +7635,7 @@
       <w:pPr>
         <w:pStyle w:val="Ttulo1"/>
       </w:pPr>
-      <w:bookmarkStart w:id="33" w:name="_Toc231934832"/>
-      <w:r>
-        <w:rPr>
-          <w:color w:val="1F3A68"/>
-        </w:rPr>
-        <w:lastRenderedPageBreak/>
-        <w:t>9. Gestão do Orçamento Mensal</w:t>
-      </w:r>
-      <w:bookmarkEnd w:id="33"/>
-    </w:p>
-    <w:p>
-      <w:r>
-        <w:t>Aceda através de Gestão &gt; Orçamento.</w:t>
-      </w:r>
-    </w:p>
-    <w:p>
-      <w:pPr>
-        <w:pStyle w:val="Ttulo2"/>
-      </w:pPr>
-      <w:bookmarkStart w:id="34" w:name="_Toc231934833"/>
-      <w:r>
-        <w:t>9.1. Definir o orçamento do mês</w:t>
-      </w:r>
-      <w:bookmarkEnd w:id="34"/>
-    </w:p>
-    <w:p>
-      <w:pPr>
-        <w:pStyle w:val="Listanumerada"/>
-      </w:pPr>
-      <w:r>
-        <w:t>Selecione o Mês/Ano pretendido no controlo de data.</w:t>
-      </w:r>
-    </w:p>
-    <w:p>
-      <w:pPr>
-        <w:pStyle w:val="Listanumerada"/>
-      </w:pPr>
-      <w:r>
-        <w:t>Introduza o Valor (em €) a estabelecer como limite de despesa.</w:t>
-      </w:r>
-    </w:p>
-    <w:p>
-      <w:pPr>
-        <w:pStyle w:val="Listanumerada"/>
-      </w:pPr>
-      <w:r>
-        <w:t>Clique em Guardar.</w:t>
-      </w:r>
-    </w:p>
-    <w:p>
-      <w:r>
-        <w:rPr>
-          <w:i/>
-        </w:rPr>
-        <w:t>Existe apenas um Orçamento por mês. Se já existir um valor definido para o mês selecionado, a aplicação irá perguntar se pretende alterar o valor.</w:t>
-      </w:r>
-    </w:p>
-    <w:p>
-      <w:pPr>
-        <w:jc w:val="center"/>
-      </w:pPr>
-      <w:r>
-        <w:rPr>
-          <w:b/>
-          <w:i/>
-          <w:color w:val="884400"/>
-          <w:sz w:val="20"/>
-        </w:rPr>
-        <w:t>[ INSERIR SCREENSHOT: Ecrã de definição de Orçamento mensal ]</w:t>
-      </w:r>
-    </w:p>
-    <w:p>
-      <w:pPr>
-        <w:jc w:val="center"/>
-      </w:pPr>
-      <w:r>
-        <w:rPr>
-          <w:i/>
-          <w:color w:val="808080"/>
-          <w:sz w:val="18"/>
-        </w:rPr>
-        <w:t>(substituir esta linha pela imagem correspondente)</w:t>
-      </w:r>
-    </w:p>
-    <w:p>
-      <w:pPr>
-        <w:pStyle w:val="Ttulo2"/>
-      </w:pPr>
-      <w:bookmarkStart w:id="35" w:name="_Toc231934834"/>
-      <w:r>
-        <w:t>9.2. Alterar o orçamento</w:t>
-      </w:r>
-      <w:bookmarkEnd w:id="35"/>
-    </w:p>
-    <w:p>
-      <w:r>
-        <w:t>A alteração é efetuada da mesma forma. A aplicação regista a data/hora da alteração e o utilizador que a realizou, mantendo igualmente o registo do utilizador que criou o orçamento.</w:t>
-      </w:r>
-    </w:p>
-    <w:p>
-      <w:pPr>
-        <w:pStyle w:val="Ttulo2"/>
-      </w:pPr>
-      <w:bookmarkStart w:id="36" w:name="_Toc231934835"/>
-      <w:r>
-        <w:t>9.3. Histórico de alterações</w:t>
-      </w:r>
-      <w:bookmarkEnd w:id="36"/>
-    </w:p>
-    <w:p>
-      <w:r>
-        <w:t>No ecrã de orçamento é apresentada uma área informativa com: Criado por / Em e Alterado por / Em, dando rastreabilidade total às modificações.</w:t>
-      </w:r>
-    </w:p>
-    <w:p>
-      <w:r>
-        <w:br w:type="page"/>
-      </w:r>
-    </w:p>
-    <w:p>
-      <w:pPr>
-        <w:pStyle w:val="Ttulo1"/>
-      </w:pPr>
-      <w:bookmarkStart w:id="37" w:name="_Toc231934836"/>
-      <w:r>
-        <w:rPr>
-          <w:color w:val="1F3A68"/>
-        </w:rPr>
-        <w:lastRenderedPageBreak/>
-        <w:t>10. Planeamento de Compras</w:t>
-      </w:r>
-      <w:bookmarkEnd w:id="37"/>
-    </w:p>
-    <w:p>
-      <w:r>
-        <w:t>Aceda através de Compras &gt; Listar Compras ou Compras &gt; Nova Compra.</w:t>
-      </w:r>
-    </w:p>
-    <w:p>
-      <w:pPr>
-        <w:pStyle w:val="Ttulo2"/>
-      </w:pPr>
-      <w:bookmarkStart w:id="38" w:name="_Toc231934837"/>
-      <w:r>
-        <w:t>10.1. Criar uma nova lista de compras</w:t>
-      </w:r>
-      <w:bookmarkEnd w:id="38"/>
-    </w:p>
-    <w:p>
-      <w:pPr>
-        <w:pStyle w:val="Listanumerada"/>
-      </w:pPr>
-      <w:r>
-        <w:t>Clicar em Compras &gt; Nova Compra.</w:t>
-      </w:r>
-    </w:p>
-    <w:p>
-      <w:pPr>
-        <w:pStyle w:val="Listanumerada"/>
-      </w:pPr>
-      <w:r>
-        <w:t>Introduzir um Nome identificativo (ex.: «Compras Pingo Doce — 15/03»).</w:t>
-      </w:r>
-    </w:p>
-    <w:p>
-      <w:pPr>
-        <w:pStyle w:val="Listanumerada"/>
-      </w:pPr>
-      <w:r>
-        <w:t>A data de criação e o utilizador são preenchidos automaticamente.</w:t>
-      </w:r>
-    </w:p>
-    <w:p>
-      <w:pPr>
-        <w:pStyle w:val="Listanumerada"/>
-      </w:pPr>
-      <w:r>
-        <w:t>Clicar em Guardar para começar a adicionar itens.</w:t>
-      </w:r>
-    </w:p>
-    <w:p>
-      <w:pPr>
-        <w:jc w:val="center"/>
-      </w:pPr>
-      <w:r>
-        <w:rPr>
-          <w:b/>
-          <w:i/>
-          <w:color w:val="884400"/>
-          <w:sz w:val="20"/>
-        </w:rPr>
-        <w:t>[ INSERIR SCREENSHOT: Criação de uma nova Compra ]</w:t>
-      </w:r>
-    </w:p>
-    <w:p>
-      <w:pPr>
-        <w:jc w:val="center"/>
-      </w:pPr>
-      <w:r>
-        <w:rPr>
-          <w:i/>
-          <w:color w:val="808080"/>
-          <w:sz w:val="18"/>
-        </w:rPr>
-        <w:t>(substituir esta linha pela imagem correspondente)</w:t>
-      </w:r>
-    </w:p>
-    <w:p>
-      <w:pPr>
-        <w:pStyle w:val="Ttulo2"/>
-      </w:pPr>
-      <w:bookmarkStart w:id="39" w:name="_Toc231934838"/>
-      <w:r>
-        <w:t>10.2. Adicionar itens previstos</w:t>
-      </w:r>
-      <w:bookmarkEnd w:id="39"/>
-    </w:p>
-    <w:p>
-      <w:pPr>
-        <w:pStyle w:val="Listanumerada"/>
-      </w:pPr>
-      <w:r>
-        <w:t>Clicar em Adicionar Item Previsto.</w:t>
-      </w:r>
-    </w:p>
-    <w:p>
-      <w:pPr>
-        <w:pStyle w:val="Listanumerada"/>
-      </w:pPr>
-      <w:r>
-        <w:t>Selecionar o Tipo de Artigo no primeiro ComboBox (filtro obrigatório).</w:t>
-      </w:r>
-    </w:p>
-    <w:p>
-      <w:pPr>
-        <w:pStyle w:val="Listanumerada"/>
-      </w:pPr>
-      <w:r>
-        <w:t>Selecionar o Artigo pretendido no segundo ComboBox.</w:t>
-      </w:r>
-    </w:p>
-    <w:p>
-      <w:pPr>
-        <w:pStyle w:val="Listanumerada"/>
-      </w:pPr>
-      <w:r>
-        <w:t>Indicar a Quantidade Prevista a adquirir.</w:t>
-      </w:r>
-    </w:p>
-    <w:p>
-      <w:pPr>
-        <w:pStyle w:val="Listanumerada"/>
-      </w:pPr>
-      <w:r>
-        <w:t>Clicar em Adicionar. O item passa a constar da lista da compra.</w:t>
-      </w:r>
-    </w:p>
-    <w:p>
-      <w:pPr>
-        <w:jc w:val="center"/>
-      </w:pPr>
-      <w:r>
-        <w:rPr>
-          <w:b/>
-          <w:i/>
-          <w:color w:val="884400"/>
-          <w:sz w:val="20"/>
-        </w:rPr>
-        <w:t>[ INSERIR SCREENSHOT: Adição de Itens Previstos a uma Compra ]</w:t>
-      </w:r>
-    </w:p>
-    <w:p>
-      <w:pPr>
-        <w:jc w:val="center"/>
-      </w:pPr>
-      <w:r>
-        <w:rPr>
-          <w:i/>
-          <w:color w:val="808080"/>
-          <w:sz w:val="18"/>
-        </w:rPr>
-        <w:t>(substituir esta linha pela imagem correspondente)</w:t>
-      </w:r>
-    </w:p>
-    <w:p>
-      <w:pPr>
-        <w:pStyle w:val="Ttulo2"/>
-      </w:pPr>
-      <w:bookmarkStart w:id="40" w:name="_Toc231934839"/>
-      <w:r>
-        <w:t>10.3. Editar a lista (enquanto aberta)</w:t>
-      </w:r>
-      <w:bookmarkEnd w:id="40"/>
-    </w:p>
-    <w:p>
-      <w:r>
-        <w:t>Enquanto a compra estiver aberta (estado Não Fechada), pode adicionar, alterar ou remover itens previstos. A aplicação regista quem fez cada alteração e a respetiva data.</w:t>
-      </w:r>
-    </w:p>
-    <w:p>
-      <w:r>
-        <w:rPr>
-          <w:i/>
-        </w:rPr>
-        <w:t>Compras fechadas ficam em modo de leitura — não é permitida qualquer alteração.</w:t>
-      </w:r>
-    </w:p>
-    <w:p>
-      <w:r>
-        <w:br w:type="page"/>
-      </w:r>
-    </w:p>
-    <w:p>
-      <w:pPr>
-        <w:pStyle w:val="Ttulo1"/>
-      </w:pPr>
-      <w:bookmarkStart w:id="41" w:name="_Toc231934840"/>
-      <w:r>
-        <w:rPr>
-          <w:color w:val="1F3A68"/>
-        </w:rPr>
-        <w:lastRenderedPageBreak/>
-        <w:t>11. Modo Compra — Execução da Compra</w:t>
-      </w:r>
-      <w:bookmarkEnd w:id="41"/>
-    </w:p>
-    <w:p>
-      <w:r>
-        <w:t>O Modo Compra é utilizado no momento em que está fisicamente a fazer a compra. Permite registar o que foi efetivamente adquirido, quantidades reais, preços e itens não previstos.</w:t>
-      </w:r>
-    </w:p>
-    <w:p>
-      <w:pPr>
-        <w:pStyle w:val="Ttulo2"/>
-      </w:pPr>
-      <w:bookmarkStart w:id="42" w:name="_Toc231934841"/>
-      <w:r>
-        <w:t>11.1. Entrar em modo compra</w:t>
-      </w:r>
-      <w:bookmarkEnd w:id="42"/>
-    </w:p>
-    <w:p>
-      <w:pPr>
-        <w:pStyle w:val="Listanumerada"/>
-      </w:pPr>
-      <w:r>
-        <w:t>Em Compras &gt; Listar Compras, selecionar a compra pretendida.</w:t>
-      </w:r>
-    </w:p>
-    <w:p>
-      <w:pPr>
-        <w:pStyle w:val="Listanumerada"/>
-      </w:pPr>
-      <w:r>
-        <w:t>Clicar em Iniciar Compra.</w:t>
-      </w:r>
-    </w:p>
-    <w:p>
-      <w:pPr>
-        <w:pStyle w:val="Listanumerada"/>
-      </w:pPr>
-      <w:r>
-        <w:t>O ecrã apresenta a lista de itens previstos e o orçamento disponível.</w:t>
-      </w:r>
-    </w:p>
-    <w:p>
-      <w:pPr>
-        <w:jc w:val="center"/>
-      </w:pPr>
-      <w:r>
-        <w:rPr>
-          <w:b/>
-          <w:i/>
-          <w:color w:val="884400"/>
-          <w:sz w:val="20"/>
-        </w:rPr>
-        <w:t>[ INSERIR SCREENSHOT: Modo Compra com itens previstos e orçamento visível ]</w:t>
-      </w:r>
-    </w:p>
-    <w:p>
-      <w:pPr>
-        <w:jc w:val="center"/>
-      </w:pPr>
-      <w:r>
-        <w:rPr>
-          <w:i/>
-          <w:color w:val="808080"/>
-          <w:sz w:val="18"/>
-        </w:rPr>
-        <w:t>(substituir esta linha pela imagem correspondente)</w:t>
-      </w:r>
-    </w:p>
-    <w:p>
-      <w:pPr>
-        <w:pStyle w:val="Ttulo2"/>
-      </w:pPr>
-      <w:bookmarkStart w:id="43" w:name="_Toc231934842"/>
-      <w:r>
-        <w:t>11.2. Registar aquisição de itens previstos</w:t>
-      </w:r>
-      <w:bookmarkEnd w:id="43"/>
-    </w:p>
-    <w:p>
-      <w:pPr>
-        <w:pStyle w:val="Listanumerada"/>
-      </w:pPr>
-      <w:r>
-        <w:t>Selecionar a linha do item previsto a adquirir.</w:t>
-      </w:r>
-    </w:p>
-    <w:p>
-      <w:pPr>
-        <w:pStyle w:val="Listanumerada"/>
-      </w:pPr>
-      <w:r>
-        <w:t>Indicar a Quantidade Adquirida (pode diferir da prevista).</w:t>
-      </w:r>
-    </w:p>
-    <w:p>
-      <w:pPr>
-        <w:pStyle w:val="Listanumerada"/>
-      </w:pPr>
-      <w:r>
-        <w:t>Indicar o Preço Unitário praticado (€).</w:t>
-      </w:r>
-    </w:p>
-    <w:p>
-      <w:pPr>
-        <w:pStyle w:val="Listanumerada"/>
-      </w:pPr>
-      <w:r>
-        <w:t>Clicar em Confirmar Item. O valor total do item é calculado automaticamente e descontado ao orçamento disponível.</w:t>
-      </w:r>
-    </w:p>
-    <w:p>
-      <w:pPr>
-        <w:pStyle w:val="Ttulo2"/>
-      </w:pPr>
-      <w:bookmarkStart w:id="44" w:name="_Toc231934843"/>
-      <w:r>
-        <w:t>11.3. Adicionar itens não previstos</w:t>
-      </w:r>
-      <w:bookmarkEnd w:id="44"/>
-    </w:p>
-    <w:p>
-      <w:pPr>
-        <w:pStyle w:val="Listanumerada"/>
-      </w:pPr>
-      <w:r>
-        <w:t>Clicar em Adicionar Item Não Previsto.</w:t>
-      </w:r>
-    </w:p>
-    <w:p>
-      <w:pPr>
-        <w:pStyle w:val="Listanumerada"/>
-      </w:pPr>
-      <w:r>
-        <w:t>Selecionar Tipo de Artigo e Artigo (filtro obrigatório por tipo).</w:t>
-      </w:r>
-    </w:p>
-    <w:p>
-      <w:pPr>
-        <w:pStyle w:val="Listanumerada"/>
-      </w:pPr>
-      <w:r>
-        <w:t>Indicar Quantidade Adquirida, Preço Unitário e (opcional) Observações.</w:t>
-      </w:r>
-    </w:p>
-    <w:p>
-      <w:pPr>
-        <w:pStyle w:val="Listanumerada"/>
-      </w:pPr>
-      <w:r>
-        <w:t>Clicar em Adicionar. O item entra na lista já como Adquirido.</w:t>
-      </w:r>
-    </w:p>
-    <w:p>
-      <w:pPr>
-        <w:jc w:val="center"/>
-      </w:pPr>
-      <w:r>
-        <w:rPr>
-          <w:b/>
-          <w:i/>
-          <w:color w:val="884400"/>
-          <w:sz w:val="20"/>
-        </w:rPr>
-        <w:t>[ INSERIR SCREENSHOT: Adição de Item Não Previsto durante o Modo Compra ]</w:t>
-      </w:r>
-    </w:p>
-    <w:p>
-      <w:pPr>
-        <w:jc w:val="center"/>
-      </w:pPr>
-      <w:r>
-        <w:rPr>
-          <w:i/>
-          <w:color w:val="808080"/>
-          <w:sz w:val="18"/>
-        </w:rPr>
-        <w:t>(substituir esta linha pela imagem correspondente)</w:t>
-      </w:r>
-    </w:p>
-    <w:p>
-      <w:pPr>
-        <w:pStyle w:val="Ttulo2"/>
-      </w:pPr>
-      <w:bookmarkStart w:id="45" w:name="_Toc231934844"/>
-      <w:r>
-        <w:t>11.4. Acompanhamento do orçamento em tempo real</w:t>
-      </w:r>
-      <w:bookmarkEnd w:id="45"/>
-    </w:p>
-    <w:p>
-      <w:r>
-        <w:t>No topo do ecrã é exibido o painel de Orçamento com três valores:</w:t>
-      </w:r>
-    </w:p>
-    <w:p>
-      <w:pPr>
-        <w:pStyle w:val="Listacommarcas"/>
-        <w:ind w:left="340"/>
-      </w:pPr>
-      <w:r>
-        <w:t>Orçamento mensal definido.</w:t>
-      </w:r>
-    </w:p>
-    <w:p>
-      <w:pPr>
-        <w:pStyle w:val="Listacommarcas"/>
-        <w:ind w:left="340"/>
-      </w:pPr>
-      <w:r>
-        <w:t>Total já gasto no mês corrente (incluindo a compra atual em curso).</w:t>
-      </w:r>
-    </w:p>
-    <w:p>
-      <w:pPr>
-        <w:pStyle w:val="Listacommarcas"/>
-        <w:ind w:left="340"/>
-      </w:pPr>
-      <w:r>
-        <w:t>Disponível — diferença entre o orçamento e o gasto.</w:t>
-      </w:r>
-    </w:p>
-    <w:p>
-      <w:r>
-        <w:t>Estes valores são atualizados a cada novo item registado.</w:t>
-      </w:r>
-    </w:p>
-    <w:p>
-      <w:pPr>
-        <w:pStyle w:val="Ttulo2"/>
-      </w:pPr>
-      <w:bookmarkStart w:id="46" w:name="_Toc231934845"/>
-      <w:r>
-        <w:t>11.5. Alerta de orçamento ultrapassado</w:t>
-      </w:r>
-      <w:bookmarkEnd w:id="46"/>
-    </w:p>
-    <w:p>
-      <w:r>
-        <w:t>Se a soma do gasto atingir ou ultrapassar o orçamento mensal, a aplicação apresenta um alerta visual destacado (zona a vermelho no painel de orçamento e mensagem «Orçamento ultrapassado!»). O registo de itens continua a ser permitido — o alerta tem apenas carácter informativo.</w:t>
-      </w:r>
-    </w:p>
-    <w:p>
-      <w:pPr>
-        <w:jc w:val="center"/>
-      </w:pPr>
-      <w:r>
-        <w:rPr>
-          <w:b/>
-          <w:i/>
-          <w:color w:val="884400"/>
-          <w:sz w:val="20"/>
-        </w:rPr>
-        <w:t>[ INSERIR SCREENSHOT: Alerta de orçamento ultrapassado no Modo Compra ]</w:t>
-      </w:r>
-    </w:p>
-    <w:p>
-      <w:pPr>
-        <w:jc w:val="center"/>
-      </w:pPr>
-      <w:r>
-        <w:rPr>
-          <w:i/>
-          <w:color w:val="808080"/>
-          <w:sz w:val="18"/>
-        </w:rPr>
-        <w:t>(substituir esta linha pela imagem correspondente)</w:t>
-      </w:r>
-    </w:p>
-    <w:p>
-      <w:pPr>
-        <w:pStyle w:val="Ttulo2"/>
-      </w:pPr>
-      <w:bookmarkStart w:id="47" w:name="_Toc231934846"/>
-      <w:r>
-        <w:lastRenderedPageBreak/>
-        <w:t>11.6. Fechar a compra</w:t>
-      </w:r>
-      <w:bookmarkEnd w:id="47"/>
-    </w:p>
-    <w:p>
-      <w:pPr>
-        <w:pStyle w:val="Listanumerada"/>
-      </w:pPr>
-      <w:r>
-        <w:t>Após registar todos os itens, clicar em Fechar Compra.</w:t>
-      </w:r>
-    </w:p>
-    <w:p>
-      <w:pPr>
-        <w:pStyle w:val="Listanumerada"/>
-      </w:pPr>
-      <w:r>
-        <w:t>Confirmar a operação no diálogo apresentado.</w:t>
-      </w:r>
-    </w:p>
-    <w:p>
-      <w:pPr>
-        <w:pStyle w:val="Listanumerada"/>
-      </w:pPr>
-      <w:r>
-        <w:t>A compra passa ao estado Fechada, ficando registadas a data/hora de fecho e o utilizador que a fechou.</w:t>
-      </w:r>
-    </w:p>
-    <w:p>
-      <w:r>
-        <w:rPr>
-          <w:i/>
-        </w:rPr>
-        <w:t>Atenção: depois de fechada, a compra não poderá ser reaberta nem alterada.</w:t>
-      </w:r>
-    </w:p>
-    <w:p>
-      <w:r>
-        <w:br w:type="page"/>
-      </w:r>
-    </w:p>
-    <w:p>
-      <w:pPr>
-        <w:pStyle w:val="Ttulo1"/>
-      </w:pPr>
-      <w:bookmarkStart w:id="48" w:name="_Toc231934847"/>
-      <w:r>
-        <w:rPr>
-          <w:color w:val="1F3A68"/>
-        </w:rPr>
-        <w:lastRenderedPageBreak/>
-        <w:t>12. Exportação de Dados (CSV)</w:t>
-      </w:r>
-      <w:bookmarkEnd w:id="48"/>
-    </w:p>
-    <w:p>
-      <w:pPr>
-        <w:pStyle w:val="Ttulo2"/>
-      </w:pPr>
-      <w:bookmarkStart w:id="49" w:name="_Toc231934848"/>
-      <w:r>
-        <w:t>12.1. Exportar compra fechada</w:t>
-      </w:r>
-      <w:bookmarkEnd w:id="49"/>
-    </w:p>
-    <w:p>
-      <w:pPr>
-        <w:pStyle w:val="Listanumerada"/>
-      </w:pPr>
-      <w:r>
-        <w:t>Aceder a Compras &gt; Listar Compras.</w:t>
-      </w:r>
-    </w:p>
-    <w:p>
-      <w:pPr>
-        <w:pStyle w:val="Listanumerada"/>
-      </w:pPr>
-      <w:r>
-        <w:t>Selecionar uma compra no estado Fechada.</w:t>
-      </w:r>
-    </w:p>
-    <w:p>
-      <w:pPr>
-        <w:pStyle w:val="Listanumerada"/>
-      </w:pPr>
-      <w:r>
-        <w:t>Clicar em Exportar CSV.</w:t>
-      </w:r>
-    </w:p>
-    <w:p>
-      <w:pPr>
-        <w:pStyle w:val="Listanumerada"/>
-      </w:pPr>
-      <w:r>
-        <w:t>Escolher o local e nome do ficheiro a guardar.</w:t>
-      </w:r>
-    </w:p>
-    <w:p>
-      <w:pPr>
-        <w:jc w:val="center"/>
-      </w:pPr>
-      <w:r>
-        <w:rPr>
-          <w:b/>
-          <w:i/>
-          <w:color w:val="884400"/>
-          <w:sz w:val="20"/>
-        </w:rPr>
-        <w:t>[ INSERIR SCREENSHOT: Diálogo de exportação de compra para CSV ]</w:t>
-      </w:r>
-    </w:p>
-    <w:p>
-      <w:pPr>
-        <w:jc w:val="center"/>
-      </w:pPr>
-      <w:r>
-        <w:rPr>
-          <w:i/>
-          <w:color w:val="808080"/>
-          <w:sz w:val="18"/>
-        </w:rPr>
-        <w:t>(substituir esta linha pela imagem correspondente)</w:t>
-      </w:r>
-    </w:p>
-    <w:p>
-      <w:pPr>
-        <w:pStyle w:val="Ttulo2"/>
-      </w:pPr>
-      <w:bookmarkStart w:id="50" w:name="_Toc231934849"/>
-      <w:r>
-        <w:t>12.2. Estrutura do ficheiro CSV</w:t>
-      </w:r>
-      <w:bookmarkEnd w:id="50"/>
-    </w:p>
-    <w:p>
-      <w:r>
-        <w:t>O delimitador utilizado é o ponto e vírgula («;»). As colunas exportadas são, por esta ordem:</w:t>
-      </w:r>
-    </w:p>
-    <w:p>
-      <w:pPr>
-        <w:pStyle w:val="Listacommarcas"/>
-        <w:ind w:left="340"/>
-      </w:pPr>
-      <w:r>
-        <w:t>NomeCompra</w:t>
-      </w:r>
-    </w:p>
-    <w:p>
-      <w:pPr>
-        <w:pStyle w:val="Listacommarcas"/>
-        <w:ind w:left="340"/>
-      </w:pPr>
-      <w:r>
-        <w:t>DataCriacao</w:t>
-      </w:r>
-    </w:p>
-    <w:p>
-      <w:pPr>
-        <w:pStyle w:val="Listacommarcas"/>
-        <w:ind w:left="340"/>
-      </w:pPr>
-      <w:r>
-        <w:t>DataFechada</w:t>
-      </w:r>
-    </w:p>
-    <w:p>
-      <w:pPr>
-        <w:pStyle w:val="Listacommarcas"/>
-        <w:ind w:left="340"/>
-      </w:pPr>
-      <w:r>
-        <w:t>NomeArtigo</w:t>
-      </w:r>
-    </w:p>
-    <w:p>
-      <w:pPr>
-        <w:pStyle w:val="Listacommarcas"/>
-        <w:ind w:left="340"/>
-      </w:pPr>
-      <w:r>
-        <w:t>ArtigoPrevisto (Sim/Não)</w:t>
-      </w:r>
-    </w:p>
-    <w:p>
-      <w:pPr>
-        <w:pStyle w:val="Listacommarcas"/>
-        <w:ind w:left="340"/>
-      </w:pPr>
-      <w:r>
-        <w:t>ArtigoNaoPrevisto (Sim/Não)</w:t>
-      </w:r>
-    </w:p>
-    <w:p>
-      <w:pPr>
-        <w:pStyle w:val="Listacommarcas"/>
-        <w:ind w:left="340"/>
-      </w:pPr>
-      <w:r>
-        <w:t>QuantidadePrevista</w:t>
-      </w:r>
-    </w:p>
-    <w:p>
-      <w:pPr>
-        <w:pStyle w:val="Listacommarcas"/>
-        <w:ind w:left="340"/>
-      </w:pPr>
-      <w:r>
-        <w:t>QuantidadeAdquirida</w:t>
-      </w:r>
-    </w:p>
-    <w:p>
-      <w:pPr>
-        <w:pStyle w:val="Listacommarcas"/>
-        <w:ind w:left="340"/>
-      </w:pPr>
-      <w:r>
-        <w:t>PrecoUnitario</w:t>
-      </w:r>
-    </w:p>
-    <w:p>
-      <w:r>
-        <w:t>O ficheiro pode ser aberto em Excel, LibreOffice Calc ou qualquer editor de texto.</w:t>
-      </w:r>
-    </w:p>
-    <w:p>
-      <w:r>
-        <w:br w:type="page"/>
-      </w:r>
-    </w:p>
-    <w:p>
-      <w:pPr>
-        <w:pStyle w:val="Ttulo1"/>
-      </w:pPr>
-      <w:bookmarkStart w:id="51" w:name="_Toc231934850"/>
-      <w:r>
-        <w:rPr>
-          <w:color w:val="1F3A68"/>
-        </w:rPr>
-        <w:lastRenderedPageBreak/>
-        <w:t>13. Estatísticas e Sugestões</w:t>
-      </w:r>
-      <w:bookmarkEnd w:id="51"/>
-    </w:p>
-    <w:p>
-      <w:r>
-        <w:t>Aceda através de Estatísticas no menu principal. O ecrã está organizado em dois separadores.</w:t>
-      </w:r>
-    </w:p>
-    <w:p>
-      <w:pPr>
-        <w:pStyle w:val="Ttulo2"/>
-      </w:pPr>
-      <w:bookmarkStart w:id="52" w:name="_Toc231934851"/>
-      <w:r>
-        <w:t>13.1. Separador 1 — Análise histórica</w:t>
-      </w:r>
-      <w:bookmarkEnd w:id="52"/>
-    </w:p>
-    <w:p>
-      <w:r>
-        <w:t>Apresenta duas tabelas:</w:t>
-      </w:r>
-    </w:p>
-    <w:p>
-      <w:pPr>
-        <w:pStyle w:val="Listacommarcas"/>
-        <w:ind w:left="340"/>
-      </w:pPr>
-      <w:r>
-        <w:t>Resumo Mensal — para cada mês: Orçamento, Total de Compras e Diferença (positiva ou negativa).</w:t>
-      </w:r>
-    </w:p>
-    <w:p>
-      <w:pPr>
-        <w:pStyle w:val="Listacommarcas"/>
-        <w:ind w:left="340"/>
-      </w:pPr>
-      <w:r>
-        <w:t>Compras Fechadas — listagem das compras com a percentagem de itens previstos vs. não previstos.</w:t>
-      </w:r>
-    </w:p>
-    <w:p>
-      <w:pPr>
-        <w:jc w:val="center"/>
-      </w:pPr>
-      <w:r>
-        <w:rPr>
-          <w:b/>
-          <w:i/>
-          <w:color w:val="884400"/>
-          <w:sz w:val="20"/>
-        </w:rPr>
-        <w:t>[ INSERIR SCREENSHOT: Estatísticas — Separador 1 (Análise histórica) ]</w:t>
-      </w:r>
-    </w:p>
-    <w:p>
-      <w:pPr>
-        <w:jc w:val="center"/>
-      </w:pPr>
-      <w:r>
-        <w:rPr>
-          <w:i/>
-          <w:color w:val="808080"/>
-          <w:sz w:val="18"/>
-        </w:rPr>
-        <w:t>(substituir esta linha pela imagem correspondente)</w:t>
-      </w:r>
-    </w:p>
-    <w:p>
-      <w:pPr>
-        <w:pStyle w:val="Ttulo2"/>
-      </w:pPr>
-      <w:bookmarkStart w:id="53" w:name="_Toc231934852"/>
-      <w:r>
-        <w:t>13.2. Separador 2 — Sugestões para o próximo mês</w:t>
-      </w:r>
-      <w:bookmarkEnd w:id="53"/>
-    </w:p>
-    <w:p>
-      <w:r>
-        <w:t>Com base no histórico, a aplicação produz duas sugestões:</w:t>
-      </w:r>
-    </w:p>
-    <w:p>
-      <w:pPr>
-        <w:pStyle w:val="Listacommarcas"/>
-        <w:ind w:left="340"/>
-      </w:pPr>
-      <w:r>
-        <w:t>Sugestão de Orçamento — calculada a partir dos orçamentos e gastos dos meses anteriores.</w:t>
-      </w:r>
-    </w:p>
-    <w:p>
-      <w:pPr>
-        <w:pStyle w:val="Listacommarcas"/>
-        <w:ind w:left="340"/>
-      </w:pPr>
-      <w:r>
-        <w:t>Sugestão de Lista de Compras — gerada considerando a semana atual do mês e as listas realizadas em semanas equivalentes em períodos anteriores.</w:t>
-      </w:r>
-    </w:p>
-    <w:p>
-      <w:pPr>
-        <w:jc w:val="center"/>
-      </w:pPr>
-      <w:r>
-        <w:rPr>
-          <w:b/>
-          <w:i/>
-          <w:color w:val="884400"/>
-          <w:sz w:val="20"/>
-        </w:rPr>
-        <w:t>[ INSERIR SCREENSHOT: Estatísticas — Separador 2 (Sugestões) ]</w:t>
-      </w:r>
-    </w:p>
-    <w:p>
-      <w:pPr>
-        <w:jc w:val="center"/>
-      </w:pPr>
-      <w:r>
-        <w:rPr>
-          <w:i/>
-          <w:color w:val="808080"/>
-          <w:sz w:val="18"/>
-        </w:rPr>
-        <w:t>(substituir esta linha pela imagem correspondente)</w:t>
-      </w:r>
-    </w:p>
-    <w:p>
-      <w:r>
-        <w:br w:type="page"/>
-      </w:r>
-    </w:p>
-    <w:p>
-      <w:pPr>
-        <w:pStyle w:val="Ttulo1"/>
-      </w:pPr>
-      <w:bookmarkStart w:id="54" w:name="_Toc231934853"/>
+      <w:bookmarkStart w:id="53" w:name="_Toc231934853"/>
       <w:r>
         <w:rPr>
           <w:color w:val="1F3A68"/>
@@ -7574,7 +7643,7 @@
         <w:lastRenderedPageBreak/>
         <w:t>14. Resolução de Problemas (FAQ)</w:t>
       </w:r>
-      <w:bookmarkEnd w:id="54"/>
+      <w:bookmarkEnd w:id="53"/>
     </w:p>
     <w:p>
       <w:r>
@@ -7697,7 +7766,7 @@
       <w:pPr>
         <w:pStyle w:val="Ttulo1"/>
       </w:pPr>
-      <w:bookmarkStart w:id="55" w:name="_Toc231934854"/>
+      <w:bookmarkStart w:id="54" w:name="_Toc231934854"/>
       <w:r>
         <w:rPr>
           <w:color w:val="1F3A68"/>
@@ -7705,7 +7774,7 @@
         <w:lastRenderedPageBreak/>
         <w:t>15. Boas Práticas de Utilização</w:t>
       </w:r>
-      <w:bookmarkEnd w:id="55"/>
+      <w:bookmarkEnd w:id="54"/>
     </w:p>
     <w:p>
       <w:pPr>
@@ -7774,14 +7843,14 @@
       <w:pPr>
         <w:pStyle w:val="Ttulo1"/>
       </w:pPr>
-      <w:bookmarkStart w:id="56" w:name="_Toc231934855"/>
+      <w:bookmarkStart w:id="55" w:name="_Toc231934855"/>
       <w:r>
         <w:rPr>
           <w:color w:val="1F3A68"/>
         </w:rPr>
         <w:t>16. Glossário</w:t>
       </w:r>
-      <w:bookmarkEnd w:id="56"/>
+      <w:bookmarkEnd w:id="55"/>
     </w:p>
     <w:p>
       <w:r>
@@ -7883,73 +7952,23 @@
       </w:r>
     </w:p>
     <w:p>
-      <w:r>
-        <w:br w:type="page"/>
-      </w:r>
-    </w:p>
-    <w:p>
-      <w:pPr>
-        <w:pStyle w:val="Ttulo1"/>
-      </w:pPr>
-      <w:bookmarkStart w:id="57" w:name="_Toc231934856"/>
-      <w:r>
-        <w:rPr>
-          <w:color w:val="1F3A68"/>
-        </w:rPr>
-        <w:lastRenderedPageBreak/>
-        <w:t>17. Anexos</w:t>
-      </w:r>
-      <w:bookmarkEnd w:id="57"/>
-    </w:p>
-    <w:p>
-      <w:r>
-        <w:t>Sugere-se a inclusão dos seguintes anexos para complementar o manual:</w:t>
-      </w:r>
-    </w:p>
-    <w:p>
-      <w:pPr>
-        <w:pStyle w:val="Listacommarcas"/>
-        <w:ind w:left="340"/>
-      </w:pPr>
-      <w:r>
-        <w:t>Anexo A — Diagrama de Classes / Modelo de Dados.</w:t>
-      </w:r>
-    </w:p>
-    <w:p>
-      <w:pPr>
-        <w:pStyle w:val="Listacommarcas"/>
-        <w:ind w:left="340"/>
-      </w:pPr>
-      <w:r>
-        <w:t>Anexo B — Mapa de navegação entre formulários.</w:t>
-      </w:r>
-    </w:p>
-    <w:p>
-      <w:pPr>
-        <w:pStyle w:val="Listacommarcas"/>
-        <w:ind w:left="340"/>
-      </w:pPr>
-      <w:r>
-        <w:t>Anexo C — Conjunto completo de capturas de ecrã (uma por ecrã principal).</w:t>
-      </w:r>
-    </w:p>
-    <w:p>
-      <w:pPr>
-        <w:pStyle w:val="Listacommarcas"/>
-        <w:ind w:left="340"/>
-      </w:pPr>
-      <w:r>
-        <w:t>Anexo D — Exemplo de ficheiro CSV exportado.</w:t>
-      </w:r>
-    </w:p>
-    <w:p>
-      <w:r>
-        <w:t xml:space="preserve"> </w:t>
-      </w:r>
-    </w:p>
-    <w:p>
-      <w:pPr>
-        <w:jc w:val="center"/>
+      <w:pPr>
+        <w:ind w:left="1440" w:firstLine="720"/>
+      </w:pPr>
+    </w:p>
+    <w:p>
+      <w:pPr>
+        <w:ind w:left="1440" w:firstLine="720"/>
+      </w:pPr>
+    </w:p>
+    <w:p>
+      <w:pPr>
+        <w:ind w:left="1440" w:firstLine="720"/>
+      </w:pPr>
+    </w:p>
+    <w:p>
+      <w:pPr>
+        <w:ind w:left="1440" w:firstLine="720"/>
       </w:pPr>
       <w:r>
         <w:rPr>
@@ -7960,7 +7979,7 @@
       </w:r>
     </w:p>
     <w:sectPr>
-      <w:headerReference w:type="default" r:id="rId15"/>
+      <w:headerReference w:type="default" r:id="rId22"/>
       <w:pgSz w:w="12240" w:h="15840"/>
       <w:pgMar w:top="1247" w:right="1417" w:bottom="1247" w:left="1417" w:header="720" w:footer="720" w:gutter="0"/>
       <w:cols w:space="720"/>
@@ -8028,6 +8047,9 @@
       <w:jc w:val="right"/>
     </w:pPr>
     <w:r>
+      <w:rPr>
+        <w:noProof/>
+      </w:rPr>
       <w:drawing>
         <wp:anchor distT="0" distB="0" distL="114300" distR="114300" simplePos="0" relativeHeight="251658240" behindDoc="1" locked="0" layoutInCell="1" allowOverlap="1" wp14:anchorId="266CEDC8" wp14:editId="133471BB">
           <wp:simplePos x="0" y="0"/>
@@ -9369,6 +9391,7 @@
   <w:style w:type="character" w:default="1" w:styleId="Tipodeletrapredefinidodopargrafo">
     <w:name w:val="Default Paragraph Font"/>
     <w:uiPriority w:val="1"/>
+    <w:semiHidden/>
     <w:unhideWhenUsed/>
   </w:style>
   <w:style w:type="table" w:default="1" w:styleId="Tabelanormal">

</xml_diff>